<commit_message>
fix: settings date convert
Co-Authored-By: Claude Opus 5.5 <noreply@anthropic.com>
</commit_message>
<xml_diff>
--- a/django/docs/Guia-entorno-desarrollo.docx
+++ b/django/docs/Guia-entorno-desarrollo.docx
@@ -1623,7 +1623,54 @@
           <w:sz w:val="22"/>
           <w:szCs w:val="22"/>
         </w:rPr>
-        <w:t xml:space="preserve">El proyecto Django está en la carpeta </w:t>
+        <w:t xml:space="preserve">El repositorio del equipo es:</w:t>
+      </w:r>
+    </w:p>
+    <w:p>
+      <w:pPr>
+        <w:spacing w:after="160"/>
+      </w:pPr>
+      <w:hyperlink w:history="1" r:id="rIdrs6s8rxenyua-lancofer">
+        <w:r>
+          <w:rPr>
+            <w:rFonts w:ascii="Calibri" w:cs="Calibri" w:eastAsia="Calibri" w:hAnsi="Calibri"/>
+            <w:color w:val="1F5FBF"/>
+            <w:sz w:val="22"/>
+            <w:szCs w:val="22"/>
+            <w:u w:val="single"/>
+          </w:rPr>
+          <w:t xml:space="preserve">https://github.com/sebastianbh/vallenata-festival-voting-system</w:t>
+        </w:r>
+      </w:hyperlink>
+    </w:p>
+    <w:p>
+      <w:pPr>
+        <w:pBdr>
+          <w:left w:val="single" w:color="C0392B" w:sz="24" w:space="8"/>
+        </w:pBdr>
+        <w:shd w:fill="FDECEA" w:color="auto" w:val="clear"/>
+        <w:spacing w:after="200" w:before="120" w:line="276"/>
+        <w:ind w:left="240" w:right="240"/>
+      </w:pPr>
+      <w:r>
+        <w:rPr>
+          <w:rFonts w:ascii="Calibri" w:cs="Calibri" w:eastAsia="Calibri" w:hAnsi="Calibri"/>
+          <w:b/>
+          <w:bCs/>
+          <w:color w:val="C0392B"/>
+          <w:sz w:val="22"/>
+          <w:szCs w:val="22"/>
+        </w:rPr>
+        <w:t xml:space="preserve">Usa este repositorio, </w:t>
+      </w:r>
+      <w:r>
+        <w:rPr>
+          <w:rFonts w:ascii="Calibri" w:cs="Calibri" w:eastAsia="Calibri" w:hAnsi="Calibri"/>
+          <w:color w:val="1A1A1A"/>
+          <w:sz w:val="22"/>
+          <w:szCs w:val="22"/>
+        </w:rPr>
+        <w:t xml:space="preserve">no el de la Entrega 1 (</w:t>
       </w:r>
       <w:r>
         <w:rPr>
@@ -1632,16 +1679,30 @@
           <w:sz w:val="20"/>
           <w:szCs w:val="20"/>
         </w:rPr>
-        <w:t xml:space="preserve">django/</w:t>
-      </w:r>
-      <w:r>
-        <w:rPr>
-          <w:rFonts w:ascii="Calibri" w:cs="Calibri" w:eastAsia="Calibri" w:hAnsi="Calibri"/>
-          <w:color w:val="1A1A1A"/>
-          <w:sz w:val="22"/>
-          <w:szCs w:val="22"/>
-        </w:rPr>
-        <w:t xml:space="preserve"> del repositorio. Según tu caso, sigue </w:t>
+        <w:t xml:space="preserve">jsanchez542-hub/vallenata-festival-voting-system</w:t>
+      </w:r>
+      <w:r>
+        <w:rPr>
+          <w:rFonts w:ascii="Calibri" w:cs="Calibri" w:eastAsia="Calibri" w:hAnsi="Calibri"/>
+          <w:color w:val="1A1A1A"/>
+          <w:sz w:val="22"/>
+          <w:szCs w:val="22"/>
+        </w:rPr>
+        <w:t xml:space="preserve">). Aquel solo tiene el prototipo HTML; el proyecto Django está únicamente en este.</w:t>
+      </w:r>
+    </w:p>
+    <w:p>
+      <w:pPr>
+        <w:spacing w:after="120" w:line="276"/>
+      </w:pPr>
+      <w:r>
+        <w:rPr>
+          <w:rFonts w:ascii="Calibri" w:cs="Calibri" w:eastAsia="Calibri" w:hAnsi="Calibri"/>
+          <w:color w:val="1A1A1A"/>
+          <w:sz w:val="22"/>
+          <w:szCs w:val="22"/>
+        </w:rPr>
+        <w:t xml:space="preserve">Según tu caso, sigue </w:t>
       </w:r>
       <w:r>
         <w:rPr>
@@ -1661,7 +1722,7 @@
           <w:sz w:val="22"/>
           <w:szCs w:val="22"/>
         </w:rPr>
-        <w:t xml:space="preserve"> de estas dos opciones.</w:t>
+        <w:t xml:space="preserve"> de estas opciones.</w:t>
       </w:r>
     </w:p>
     <w:p>
@@ -1678,7 +1739,7 @@
           <w:sz w:val="26"/>
           <w:szCs w:val="26"/>
         </w:rPr>
-        <w:t xml:space="preserve">Opción A: todavía no tienes el repositorio en tu computador</w:t>
+        <w:t xml:space="preserve">Opción A: no tienes este repositorio en tu computador</w:t>
       </w:r>
     </w:p>
     <w:p>
@@ -1711,7 +1772,7 @@
           <w:sz w:val="20"/>
           <w:szCs w:val="20"/>
         </w:rPr>
-        <w:t xml:space="preserve">git clone https://github.com/jsanchez542-hub/vallenata-festival-voting-system.git</w:t>
+        <w:t xml:space="preserve">git clone https://github.com/sebastianbh/vallenata-festival-voting-system.git votaciones-festival</w:t>
       </w:r>
     </w:p>
     <w:p>
@@ -1730,7 +1791,7 @@
           <w:sz w:val="20"/>
           <w:szCs w:val="20"/>
         </w:rPr>
-        <w:t xml:space="preserve">cd vallenata-festival-voting-system</w:t>
+        <w:t xml:space="preserve">cd votaciones-festival</w:t>
       </w:r>
     </w:p>
     <w:p>
@@ -1753,65 +1814,63 @@
           <w:sz w:val="22"/>
           <w:szCs w:val="22"/>
         </w:rPr>
-        <w:t xml:space="preserve"> descarga el repositorio completo. Luego sigue con </w:t>
-      </w:r>
+        <w:t xml:space="preserve"> descarga el repositorio completo en una carpeta nueva llamada </w:t>
+      </w:r>
+      <w:r>
+        <w:rPr>
+          <w:rFonts w:ascii="Consolas" w:cs="Consolas" w:eastAsia="Consolas" w:hAnsi="Consolas"/>
+          <w:color w:val="8B0000"/>
+          <w:sz w:val="20"/>
+          <w:szCs w:val="20"/>
+        </w:rPr>
+        <w:t xml:space="preserve">votaciones-festival</w:t>
+      </w:r>
+      <w:r>
+        <w:rPr>
+          <w:rFonts w:ascii="Calibri" w:cs="Calibri" w:eastAsia="Calibri" w:hAnsi="Calibri"/>
+          <w:color w:val="1A1A1A"/>
+          <w:sz w:val="22"/>
+          <w:szCs w:val="22"/>
+        </w:rPr>
+        <w:t xml:space="preserve">. Así no se mezcla con una copia del repositorio de la Entrega 1 que ya tengas, que se llama igual.</w:t>
+      </w:r>
+    </w:p>
+    <w:p>
+      <w:pPr>
+        <w:pStyle w:val="Heading2"/>
+        <w:spacing w:after="100" w:before="240"/>
+      </w:pPr>
       <w:r>
         <w:rPr>
           <w:rFonts w:ascii="Calibri" w:cs="Calibri" w:eastAsia="Calibri" w:hAnsi="Calibri"/>
           <w:b/>
           <w:bCs/>
           <w:color w:val="1A1A1A"/>
-          <w:sz w:val="22"/>
-          <w:szCs w:val="22"/>
-        </w:rPr>
-        <w:t xml:space="preserve">"¿En qué rama están los cambios?"</w:t>
-      </w:r>
-      <w:r>
-        <w:rPr>
-          <w:rFonts w:ascii="Calibri" w:cs="Calibri" w:eastAsia="Calibri" w:hAnsi="Calibri"/>
-          <w:color w:val="1A1A1A"/>
-          <w:sz w:val="22"/>
-          <w:szCs w:val="22"/>
-        </w:rPr>
-        <w:t xml:space="preserve">, más abajo.</w:t>
-      </w:r>
-    </w:p>
-    <w:p>
-      <w:pPr>
-        <w:pStyle w:val="Heading2"/>
-        <w:spacing w:after="100" w:before="240"/>
-      </w:pPr>
+          <w:sz w:val="26"/>
+          <w:szCs w:val="26"/>
+        </w:rPr>
+        <w:t xml:space="preserve">Opción B: ya habías clonado este repositorio antes</w:t>
+      </w:r>
+    </w:p>
+    <w:p>
+      <w:pPr>
+        <w:spacing w:after="120" w:line="276"/>
+      </w:pPr>
+      <w:r>
+        <w:rPr>
+          <w:rFonts w:ascii="Calibri" w:cs="Calibri" w:eastAsia="Calibri" w:hAnsi="Calibri"/>
+          <w:color w:val="1A1A1A"/>
+          <w:sz w:val="22"/>
+          <w:szCs w:val="22"/>
+        </w:rPr>
+        <w:t xml:space="preserve">No lo clones de nuevo. Abre la terminal </w:t>
+      </w:r>
       <w:r>
         <w:rPr>
           <w:rFonts w:ascii="Calibri" w:cs="Calibri" w:eastAsia="Calibri" w:hAnsi="Calibri"/>
           <w:b/>
           <w:bCs/>
           <w:color w:val="1A1A1A"/>
-          <w:sz w:val="26"/>
-          <w:szCs w:val="26"/>
-        </w:rPr>
-        <w:t xml:space="preserve">Opción B: ya habías clonado el repositorio antes</w:t>
-      </w:r>
-    </w:p>
-    <w:p>
-      <w:pPr>
-        <w:spacing w:after="120" w:line="276"/>
-      </w:pPr>
-      <w:r>
-        <w:rPr>
-          <w:rFonts w:ascii="Calibri" w:cs="Calibri" w:eastAsia="Calibri" w:hAnsi="Calibri"/>
-          <w:color w:val="1A1A1A"/>
-          <w:sz w:val="22"/>
-          <w:szCs w:val="22"/>
-        </w:rPr>
-        <w:t xml:space="preserve">No lo clones de nuevo. Abre la terminal </w:t>
-      </w:r>
-      <w:r>
-        <w:rPr>
-          <w:rFonts w:ascii="Calibri" w:cs="Calibri" w:eastAsia="Calibri" w:hAnsi="Calibri"/>
-          <w:b/>
-          <w:bCs/>
-          <w:color w:val="1A1A1A"/>
           <w:sz w:val="22"/>
           <w:szCs w:val="22"/>
         </w:rPr>
@@ -1824,7 +1883,7 @@
           <w:sz w:val="22"/>
           <w:szCs w:val="22"/>
         </w:rPr>
-        <w:t xml:space="preserve"> y pregúntale a GitHub qué hay de nuevo:</w:t>
+        <w:t xml:space="preserve"> y trae lo último:</w:t>
       </w:r>
     </w:p>
     <w:p>
@@ -1833,7 +1892,7 @@
           <w:left w:val="single" w:color="B8860B" w:sz="18" w:space="8"/>
         </w:pBdr>
         <w:shd w:fill="F2F2F2" w:color="auto" w:val="clear"/>
-        <w:spacing w:after="160" w:before="80"/>
+        <w:spacing w:after="0" w:before="80"/>
         <w:ind w:left="240" w:right="240"/>
       </w:pPr>
       <w:r>
@@ -1843,7 +1902,26 @@
           <w:sz w:val="20"/>
           <w:szCs w:val="20"/>
         </w:rPr>
-        <w:t xml:space="preserve">git fetch origin</w:t>
+        <w:t xml:space="preserve">git checkout main</w:t>
+      </w:r>
+    </w:p>
+    <w:p>
+      <w:pPr>
+        <w:pBdr>
+          <w:left w:val="single" w:color="B8860B" w:sz="18" w:space="8"/>
+        </w:pBdr>
+        <w:shd w:fill="F2F2F2" w:color="auto" w:val="clear"/>
+        <w:spacing w:after="160" w:before="0"/>
+        <w:ind w:left="240" w:right="240"/>
+      </w:pPr>
+      <w:r>
+        <w:rPr>
+          <w:rFonts w:ascii="Consolas" w:cs="Consolas" w:eastAsia="Consolas" w:hAnsi="Consolas"/>
+          <w:color w:val="1A1A1A"/>
+          <w:sz w:val="20"/>
+          <w:szCs w:val="20"/>
+        </w:rPr>
+        <w:t xml:space="preserve">git pull</w:t>
       </w:r>
     </w:p>
     <w:p>
@@ -1857,16 +1935,34 @@
           <w:sz w:val="20"/>
           <w:szCs w:val="20"/>
         </w:rPr>
-        <w:t xml:space="preserve">git fetch</w:t>
-      </w:r>
-      <w:r>
-        <w:rPr>
-          <w:rFonts w:ascii="Calibri" w:cs="Calibri" w:eastAsia="Calibri" w:hAnsi="Calibri"/>
-          <w:color w:val="1A1A1A"/>
-          <w:sz w:val="22"/>
-          <w:szCs w:val="22"/>
-        </w:rPr>
-        <w:t xml:space="preserve"> descarga la información de las ramas nuevas sin cambiar todavía tus archivos. Sin este paso, tu Git no sabe que existen ramas creadas por tus compañeros.</w:t>
+        <w:t xml:space="preserve">git checkout main</w:t>
+      </w:r>
+      <w:r>
+        <w:rPr>
+          <w:rFonts w:ascii="Calibri" w:cs="Calibri" w:eastAsia="Calibri" w:hAnsi="Calibri"/>
+          <w:color w:val="1A1A1A"/>
+          <w:sz w:val="22"/>
+          <w:szCs w:val="22"/>
+        </w:rPr>
+        <w:t xml:space="preserve"> te pone en la rama principal y </w:t>
+      </w:r>
+      <w:r>
+        <w:rPr>
+          <w:rFonts w:ascii="Consolas" w:cs="Consolas" w:eastAsia="Consolas" w:hAnsi="Consolas"/>
+          <w:color w:val="8B0000"/>
+          <w:sz w:val="20"/>
+          <w:szCs w:val="20"/>
+        </w:rPr>
+        <w:t xml:space="preserve">git pull</w:t>
+      </w:r>
+      <w:r>
+        <w:rPr>
+          <w:rFonts w:ascii="Calibri" w:cs="Calibri" w:eastAsia="Calibri" w:hAnsi="Calibri"/>
+          <w:color w:val="1A1A1A"/>
+          <w:sz w:val="22"/>
+          <w:szCs w:val="22"/>
+        </w:rPr>
+        <w:t xml:space="preserve"> descarga los cambios que subió el equipo.</w:t>
       </w:r>
     </w:p>
     <w:p>
@@ -1896,7 +1992,7 @@
           <w:sz w:val="22"/>
           <w:szCs w:val="22"/>
         </w:rPr>
-        <w:t xml:space="preserve">haz commit de ellos antes de cambiar de rama, o Git no te dejará cambiarte. Revísalo con </w:t>
+        <w:t xml:space="preserve">haz commit de ellos antes, o Git no te dejará cambiar de rama. Revísalo con </w:t>
       </w:r>
       <w:r>
         <w:rPr>
@@ -1915,208 +2011,6 @@
           <w:szCs w:val="22"/>
         </w:rPr>
         <w:t xml:space="preserve">.</w:t>
-      </w:r>
-    </w:p>
-    <w:p>
-      <w:pPr>
-        <w:pStyle w:val="Heading2"/>
-        <w:spacing w:after="100" w:before="240"/>
-      </w:pPr>
-      <w:r>
-        <w:rPr>
-          <w:rFonts w:ascii="Calibri" w:cs="Calibri" w:eastAsia="Calibri" w:hAnsi="Calibri"/>
-          <w:b/>
-          <w:bCs/>
-          <w:color w:val="1A1A1A"/>
-          <w:sz w:val="26"/>
-          <w:szCs w:val="26"/>
-        </w:rPr>
-        <w:t xml:space="preserve">¿En qué rama están los cambios?</w:t>
-      </w:r>
-    </w:p>
-    <w:p>
-      <w:pPr>
-        <w:spacing w:after="120" w:line="276"/>
-      </w:pPr>
-      <w:r>
-        <w:rPr>
-          <w:rFonts w:ascii="Calibri" w:cs="Calibri" w:eastAsia="Calibri" w:hAnsi="Calibri"/>
-          <w:b/>
-          <w:bCs/>
-          <w:color w:val="1A1A1A"/>
-          <w:sz w:val="22"/>
-          <w:szCs w:val="22"/>
-        </w:rPr>
-        <w:t xml:space="preserve">Si el equipo ya unió el Pull Request a `main`</w:t>
-      </w:r>
-      <w:r>
-        <w:rPr>
-          <w:rFonts w:ascii="Calibri" w:cs="Calibri" w:eastAsia="Calibri" w:hAnsi="Calibri"/>
-          <w:color w:val="1A1A1A"/>
-          <w:sz w:val="22"/>
-          <w:szCs w:val="22"/>
-        </w:rPr>
-        <w:t xml:space="preserve"> (lo normal), quédate en </w:t>
-      </w:r>
-      <w:r>
-        <w:rPr>
-          <w:rFonts w:ascii="Consolas" w:cs="Consolas" w:eastAsia="Consolas" w:hAnsi="Consolas"/>
-          <w:color w:val="8B0000"/>
-          <w:sz w:val="20"/>
-          <w:szCs w:val="20"/>
-        </w:rPr>
-        <w:t xml:space="preserve">main</w:t>
-      </w:r>
-      <w:r>
-        <w:rPr>
-          <w:rFonts w:ascii="Calibri" w:cs="Calibri" w:eastAsia="Calibri" w:hAnsi="Calibri"/>
-          <w:color w:val="1A1A1A"/>
-          <w:sz w:val="22"/>
-          <w:szCs w:val="22"/>
-        </w:rPr>
-        <w:t xml:space="preserve"> y trae lo último:</w:t>
-      </w:r>
-    </w:p>
-    <w:p>
-      <w:pPr>
-        <w:pBdr>
-          <w:left w:val="single" w:color="B8860B" w:sz="18" w:space="8"/>
-        </w:pBdr>
-        <w:shd w:fill="F2F2F2" w:color="auto" w:val="clear"/>
-        <w:spacing w:after="0" w:before="80"/>
-        <w:ind w:left="240" w:right="240"/>
-      </w:pPr>
-      <w:r>
-        <w:rPr>
-          <w:rFonts w:ascii="Consolas" w:cs="Consolas" w:eastAsia="Consolas" w:hAnsi="Consolas"/>
-          <w:color w:val="1A1A1A"/>
-          <w:sz w:val="20"/>
-          <w:szCs w:val="20"/>
-        </w:rPr>
-        <w:t xml:space="preserve">git checkout main</w:t>
-      </w:r>
-    </w:p>
-    <w:p>
-      <w:pPr>
-        <w:pBdr>
-          <w:left w:val="single" w:color="B8860B" w:sz="18" w:space="8"/>
-        </w:pBdr>
-        <w:shd w:fill="F2F2F2" w:color="auto" w:val="clear"/>
-        <w:spacing w:after="160" w:before="0"/>
-        <w:ind w:left="240" w:right="240"/>
-      </w:pPr>
-      <w:r>
-        <w:rPr>
-          <w:rFonts w:ascii="Consolas" w:cs="Consolas" w:eastAsia="Consolas" w:hAnsi="Consolas"/>
-          <w:color w:val="1A1A1A"/>
-          <w:sz w:val="20"/>
-          <w:szCs w:val="20"/>
-        </w:rPr>
-        <w:t xml:space="preserve">git pull</w:t>
-      </w:r>
-    </w:p>
-    <w:p>
-      <w:pPr>
-        <w:spacing w:after="120" w:line="276"/>
-      </w:pPr>
-      <w:r>
-        <w:rPr>
-          <w:rFonts w:ascii="Calibri" w:cs="Calibri" w:eastAsia="Calibri" w:hAnsi="Calibri"/>
-          <w:b/>
-          <w:bCs/>
-          <w:color w:val="1A1A1A"/>
-          <w:sz w:val="22"/>
-          <w:szCs w:val="22"/>
-        </w:rPr>
-        <w:t xml:space="preserve">Si todavía no lo han unido</w:t>
-      </w:r>
-      <w:r>
-        <w:rPr>
-          <w:rFonts w:ascii="Calibri" w:cs="Calibri" w:eastAsia="Calibri" w:hAnsi="Calibri"/>
-          <w:color w:val="1A1A1A"/>
-          <w:sz w:val="22"/>
-          <w:szCs w:val="22"/>
-        </w:rPr>
-        <w:t xml:space="preserve">, los cambios siguen en la rama de trabajo. Cámbiate a ella:</w:t>
-      </w:r>
-    </w:p>
-    <w:p>
-      <w:pPr>
-        <w:pBdr>
-          <w:left w:val="single" w:color="B8860B" w:sz="18" w:space="8"/>
-        </w:pBdr>
-        <w:shd w:fill="F2F2F2" w:color="auto" w:val="clear"/>
-        <w:spacing w:after="0" w:before="80"/>
-        <w:ind w:left="240" w:right="240"/>
-      </w:pPr>
-      <w:r>
-        <w:rPr>
-          <w:rFonts w:ascii="Consolas" w:cs="Consolas" w:eastAsia="Consolas" w:hAnsi="Consolas"/>
-          <w:color w:val="1A1A1A"/>
-          <w:sz w:val="20"/>
-          <w:szCs w:val="20"/>
-        </w:rPr>
-        <w:t xml:space="preserve">git checkout feat/structure-base</w:t>
-      </w:r>
-    </w:p>
-    <w:p>
-      <w:pPr>
-        <w:pBdr>
-          <w:left w:val="single" w:color="B8860B" w:sz="18" w:space="8"/>
-        </w:pBdr>
-        <w:shd w:fill="F2F2F2" w:color="auto" w:val="clear"/>
-        <w:spacing w:after="160" w:before="0"/>
-        <w:ind w:left="240" w:right="240"/>
-      </w:pPr>
-      <w:r>
-        <w:rPr>
-          <w:rFonts w:ascii="Consolas" w:cs="Consolas" w:eastAsia="Consolas" w:hAnsi="Consolas"/>
-          <w:color w:val="1A1A1A"/>
-          <w:sz w:val="20"/>
-          <w:szCs w:val="20"/>
-        </w:rPr>
-        <w:t xml:space="preserve">git pull</w:t>
-      </w:r>
-    </w:p>
-    <w:p>
-      <w:pPr>
-        <w:spacing w:after="120" w:line="276"/>
-      </w:pPr>
-      <w:r>
-        <w:rPr>
-          <w:rFonts w:ascii="Consolas" w:cs="Consolas" w:eastAsia="Consolas" w:hAnsi="Consolas"/>
-          <w:color w:val="8B0000"/>
-          <w:sz w:val="20"/>
-          <w:szCs w:val="20"/>
-        </w:rPr>
-        <w:t xml:space="preserve">git checkout</w:t>
-      </w:r>
-      <w:r>
-        <w:rPr>
-          <w:rFonts w:ascii="Calibri" w:cs="Calibri" w:eastAsia="Calibri" w:hAnsi="Calibri"/>
-          <w:color w:val="1A1A1A"/>
-          <w:sz w:val="22"/>
-          <w:szCs w:val="22"/>
-        </w:rPr>
-        <w:t xml:space="preserve"> te cambia de rama y </w:t>
-      </w:r>
-      <w:r>
-        <w:rPr>
-          <w:rFonts w:ascii="Consolas" w:cs="Consolas" w:eastAsia="Consolas" w:hAnsi="Consolas"/>
-          <w:color w:val="8B0000"/>
-          <w:sz w:val="20"/>
-          <w:szCs w:val="20"/>
-        </w:rPr>
-        <w:t xml:space="preserve">git pull</w:t>
-      </w:r>
-      <w:r>
-        <w:rPr>
-          <w:rFonts w:ascii="Calibri" w:cs="Calibri" w:eastAsia="Calibri" w:hAnsi="Calibri"/>
-          <w:color w:val="1A1A1A"/>
-          <w:sz w:val="22"/>
-          <w:szCs w:val="22"/>
-        </w:rPr>
-        <w:t xml:space="preserve"> trae los últimos cambios de esa rama. Si no sabes cuál es tu caso, pregúntale a quien abrió el Pull Request.</w:t>
       </w:r>
     </w:p>
     <w:p>
@@ -2200,7 +2094,41 @@
           <w:sz w:val="22"/>
           <w:szCs w:val="22"/>
         </w:rPr>
-        <w:t xml:space="preserve"> adentro. Para ver en qué rama estás, usa </w:t>
+        <w:t xml:space="preserve"> adentro.</w:t>
+      </w:r>
+    </w:p>
+    <w:p>
+      <w:pPr>
+        <w:spacing w:after="120" w:line="276"/>
+      </w:pPr>
+      <w:r>
+        <w:rPr>
+          <w:rFonts w:ascii="Calibri" w:cs="Calibri" w:eastAsia="Calibri" w:hAnsi="Calibri"/>
+          <w:color w:val="1A1A1A"/>
+          <w:sz w:val="22"/>
+          <w:szCs w:val="22"/>
+        </w:rPr>
+        <w:t xml:space="preserve">Luego abre esa carpeta en VS Code: </w:t>
+      </w:r>
+      <w:r>
+        <w:rPr>
+          <w:rFonts w:ascii="Calibri" w:cs="Calibri" w:eastAsia="Calibri" w:hAnsi="Calibri"/>
+          <w:b/>
+          <w:bCs/>
+          <w:color w:val="1A1A1A"/>
+          <w:sz w:val="22"/>
+          <w:szCs w:val="22"/>
+        </w:rPr>
+        <w:t xml:space="preserve">Archivo → Abrir carpeta</w:t>
+      </w:r>
+      <w:r>
+        <w:rPr>
+          <w:rFonts w:ascii="Calibri" w:cs="Calibri" w:eastAsia="Calibri" w:hAnsi="Calibri"/>
+          <w:color w:val="1A1A1A"/>
+          <w:sz w:val="22"/>
+          <w:szCs w:val="22"/>
+        </w:rPr>
+        <w:t xml:space="preserve"> y elige la carpeta del proyecto (</w:t>
       </w:r>
       <w:r>
         <w:rPr>
@@ -2209,50 +2137,46 @@
           <w:sz w:val="20"/>
           <w:szCs w:val="20"/>
         </w:rPr>
-        <w:t xml:space="preserve">git branch</w:t>
-      </w:r>
-      <w:r>
-        <w:rPr>
-          <w:rFonts w:ascii="Calibri" w:cs="Calibri" w:eastAsia="Calibri" w:hAnsi="Calibri"/>
-          <w:color w:val="1A1A1A"/>
-          <w:sz w:val="22"/>
-          <w:szCs w:val="22"/>
-        </w:rPr>
-        <w:t xml:space="preserve">: la rama actual aparece marcada con un asterisco (*).</w:t>
-      </w:r>
-    </w:p>
-    <w:p>
-      <w:pPr>
-        <w:spacing w:after="120" w:line="276"/>
-      </w:pPr>
-      <w:r>
-        <w:rPr>
-          <w:rFonts w:ascii="Calibri" w:cs="Calibri" w:eastAsia="Calibri" w:hAnsi="Calibri"/>
-          <w:color w:val="1A1A1A"/>
-          <w:sz w:val="22"/>
-          <w:szCs w:val="22"/>
-        </w:rPr>
-        <w:t xml:space="preserve">Luego abre esa carpeta en VS Code: </w:t>
-      </w:r>
+        <w:t xml:space="preserve">votaciones-festival</w:t>
+      </w:r>
+      <w:r>
+        <w:rPr>
+          <w:rFonts w:ascii="Calibri" w:cs="Calibri" w:eastAsia="Calibri" w:hAnsi="Calibri"/>
+          <w:color w:val="1A1A1A"/>
+          <w:sz w:val="22"/>
+          <w:szCs w:val="22"/>
+        </w:rPr>
+        <w:t xml:space="preserve">).</w:t>
+      </w:r>
+    </w:p>
+    <w:p>
+      <w:pPr>
+        <w:pBdr>
+          <w:left w:val="single" w:color="B8860B" w:sz="24" w:space="8"/>
+        </w:pBdr>
+        <w:shd w:fill="FFF8E1" w:color="auto" w:val="clear"/>
+        <w:spacing w:after="200" w:before="120" w:line="276"/>
+        <w:ind w:left="240" w:right="240"/>
+      </w:pPr>
       <w:r>
         <w:rPr>
           <w:rFonts w:ascii="Calibri" w:cs="Calibri" w:eastAsia="Calibri" w:hAnsi="Calibri"/>
           <w:b/>
           <w:bCs/>
-          <w:color w:val="1A1A1A"/>
-          <w:sz w:val="22"/>
-          <w:szCs w:val="22"/>
-        </w:rPr>
-        <w:t xml:space="preserve">Archivo → Abrir carpeta</w:t>
-      </w:r>
-      <w:r>
-        <w:rPr>
-          <w:rFonts w:ascii="Calibri" w:cs="Calibri" w:eastAsia="Calibri" w:hAnsi="Calibri"/>
-          <w:color w:val="1A1A1A"/>
-          <w:sz w:val="22"/>
-          <w:szCs w:val="22"/>
-        </w:rPr>
-        <w:t xml:space="preserve"> y elige </w:t>
+          <w:color w:val="B8860B"/>
+          <w:sz w:val="22"/>
+          <w:szCs w:val="22"/>
+        </w:rPr>
+        <w:t xml:space="preserve">Para subir cambios </w:t>
+      </w:r>
+      <w:r>
+        <w:rPr>
+          <w:rFonts w:ascii="Calibri" w:cs="Calibri" w:eastAsia="Calibri" w:hAnsi="Calibri"/>
+          <w:color w:val="1A1A1A"/>
+          <w:sz w:val="22"/>
+          <w:szCs w:val="22"/>
+        </w:rPr>
+        <w:t xml:space="preserve">necesitas ser colaborador del repositorio. Pídele al dueño (</w:t>
       </w:r>
       <w:r>
         <w:rPr>
@@ -2261,16 +2185,16 @@
           <w:sz w:val="20"/>
           <w:szCs w:val="20"/>
         </w:rPr>
-        <w:t xml:space="preserve">vallenata-festival-voting-system</w:t>
-      </w:r>
-      <w:r>
-        <w:rPr>
-          <w:rFonts w:ascii="Calibri" w:cs="Calibri" w:eastAsia="Calibri" w:hAnsi="Calibri"/>
-          <w:color w:val="1A1A1A"/>
-          <w:sz w:val="22"/>
-          <w:szCs w:val="22"/>
-        </w:rPr>
-        <w:t xml:space="preserve">.</w:t>
+        <w:t xml:space="preserve">sebastianbh</w:t>
+      </w:r>
+      <w:r>
+        <w:rPr>
+          <w:rFonts w:ascii="Calibri" w:cs="Calibri" w:eastAsia="Calibri" w:hAnsi="Calibri"/>
+          <w:color w:val="1A1A1A"/>
+          <w:sz w:val="22"/>
+          <w:szCs w:val="22"/>
+        </w:rPr>
+        <w:t xml:space="preserve">) que te invite desde Settings → Collaborators y acepta la invitación que te llega por correo. Para descargar no hace falta: el repositorio es público.</w:t>
       </w:r>
     </w:p>
     <w:p>
@@ -9025,24 +8949,6 @@
                 <w:szCs w:val="20"/>
               </w:rPr>
               <w:t xml:space="preserve">main</w:t>
-            </w:r>
-            <w:r>
-              <w:rPr>
-                <w:rFonts w:ascii="Calibri" w:cs="Calibri" w:eastAsia="Calibri" w:hAnsi="Calibri"/>
-                <w:color w:val="1A1A1A"/>
-                <w:sz w:val="22"/>
-                <w:szCs w:val="22"/>
-              </w:rPr>
-              <w:t xml:space="preserve"> o </w:t>
-            </w:r>
-            <w:r>
-              <w:rPr>
-                <w:rFonts w:ascii="Consolas" w:cs="Consolas" w:eastAsia="Consolas" w:hAnsi="Consolas"/>
-                <w:color w:val="8B0000"/>
-                <w:sz w:val="20"/>
-                <w:szCs w:val="20"/>
-              </w:rPr>
-              <w:t xml:space="preserve">feat/structure-base</w:t>
             </w:r>
             <w:r>
               <w:rPr>

</xml_diff>